<commit_message>
Added path to Publish Mode.xml
</commit_message>
<xml_diff>
--- a/Documentation/PPDF Connector  - Developer’s Guide.docx
+++ b/Documentation/PPDF Connector  - Developer’s Guide.docx
@@ -1650,12 +1650,12 @@
       <w:pPr>
         <w:pStyle w:val="Heading2"/>
       </w:pPr>
-      <w:bookmarkStart w:id="1" w:name="overview"/>
-      <w:bookmarkStart w:id="2" w:name="_Toc203652338"/>
+      <w:bookmarkStart w:id="1" w:name="_Toc203652338"/>
+      <w:bookmarkStart w:id="2" w:name="overview"/>
       <w:r>
         <w:t>Overview</w:t>
       </w:r>
-      <w:bookmarkEnd w:id="2"/>
+      <w:bookmarkEnd w:id="1"/>
     </w:p>
     <w:p>
       <w:pPr>
@@ -1702,7 +1702,7 @@
         <w:pStyle w:val="Heading2"/>
       </w:pPr>
       <w:bookmarkStart w:id="3" w:name="key-files-and-their-purpose"/>
-      <w:bookmarkEnd w:id="1"/>
+      <w:bookmarkEnd w:id="2"/>
       <w:r>
         <w:t xml:space="preserve"> </w:t>
       </w:r>
@@ -1716,8 +1716,8 @@
       <w:pPr>
         <w:pStyle w:val="Heading3"/>
       </w:pPr>
-      <w:bookmarkStart w:id="5" w:name="menu.cs"/>
-      <w:bookmarkStart w:id="6" w:name="_Toc203652340"/>
+      <w:bookmarkStart w:id="5" w:name="_Toc203652340"/>
+      <w:bookmarkStart w:id="6" w:name="menu.cs"/>
       <w:r>
         <w:t xml:space="preserve">✅ </w:t>
       </w:r>
@@ -1728,7 +1728,7 @@
         </w:rPr>
         <w:t>Menu.cs</w:t>
       </w:r>
-      <w:bookmarkEnd w:id="6"/>
+      <w:bookmarkEnd w:id="5"/>
       <w:proofErr w:type="spellEnd"/>
     </w:p>
     <w:p>
@@ -1776,8 +1776,8 @@
       <w:pPr>
         <w:pStyle w:val="Heading3"/>
       </w:pPr>
-      <w:bookmarkStart w:id="7" w:name="connector.cs"/>
-      <w:bookmarkStart w:id="8" w:name="_Toc203652341"/>
+      <w:bookmarkStart w:id="7" w:name="_Toc203652341"/>
+      <w:bookmarkStart w:id="8" w:name="connector.cs"/>
       <w:r>
         <w:t xml:space="preserve">✅ </w:t>
       </w:r>
@@ -1788,7 +1788,7 @@
         </w:rPr>
         <w:t>Connector.cs</w:t>
       </w:r>
-      <w:bookmarkEnd w:id="8"/>
+      <w:bookmarkEnd w:id="7"/>
       <w:proofErr w:type="spellEnd"/>
     </w:p>
     <w:p>
@@ -1872,7 +1872,7 @@
         <w:t>Handles initialization and global logic.</w:t>
       </w:r>
     </w:p>
-    <w:bookmarkEnd w:id="7"/>
+    <w:bookmarkEnd w:id="8"/>
     <w:p>
       <w:pPr>
         <w:pStyle w:val="Compact"/>
@@ -1883,9 +1883,9 @@
       <w:pPr>
         <w:pStyle w:val="Heading3"/>
       </w:pPr>
-      <w:bookmarkStart w:id="9" w:name="propertysheet2.cs"/>
-      <w:bookmarkStart w:id="10" w:name="_Toc203652342"/>
-      <w:bookmarkEnd w:id="5"/>
+      <w:bookmarkStart w:id="9" w:name="_Toc203652342"/>
+      <w:bookmarkStart w:id="10" w:name="propertysheet2.cs"/>
+      <w:bookmarkEnd w:id="6"/>
       <w:r>
         <w:t xml:space="preserve">✅ </w:t>
       </w:r>
@@ -1902,7 +1902,7 @@
         </w:rPr>
         <w:t>.cs</w:t>
       </w:r>
-      <w:bookmarkEnd w:id="10"/>
+      <w:bookmarkEnd w:id="9"/>
       <w:proofErr w:type="spellEnd"/>
     </w:p>
     <w:p>
@@ -1952,9 +1952,9 @@
       <w:pPr>
         <w:pStyle w:val="Heading3"/>
       </w:pPr>
-      <w:bookmarkStart w:id="11" w:name="resources.resx"/>
-      <w:bookmarkStart w:id="12" w:name="_Toc203652343"/>
-      <w:bookmarkEnd w:id="9"/>
+      <w:bookmarkStart w:id="11" w:name="_Toc203652343"/>
+      <w:bookmarkStart w:id="12" w:name="resources.resx"/>
+      <w:bookmarkEnd w:id="10"/>
       <w:r>
         <w:t xml:space="preserve">✅ </w:t>
       </w:r>
@@ -1965,7 +1965,7 @@
         </w:rPr>
         <w:t>Resources.resx</w:t>
       </w:r>
-      <w:bookmarkEnd w:id="12"/>
+      <w:bookmarkEnd w:id="11"/>
       <w:proofErr w:type="spellEnd"/>
     </w:p>
     <w:p>
@@ -1991,22 +1991,22 @@
       <w:pPr>
         <w:pStyle w:val="Heading2"/>
       </w:pPr>
-      <w:bookmarkStart w:id="13" w:name="Xca9751dc26e8af37e013a090d85c206274f9c98"/>
-      <w:bookmarkStart w:id="14" w:name="_Toc203652344"/>
+      <w:bookmarkStart w:id="13" w:name="_Toc203652344"/>
+      <w:bookmarkStart w:id="14" w:name="Xca9751dc26e8af37e013a090d85c206274f9c98"/>
       <w:bookmarkEnd w:id="3"/>
-      <w:bookmarkEnd w:id="11"/>
+      <w:bookmarkEnd w:id="12"/>
       <w:r>
         <w:lastRenderedPageBreak/>
         <w:t>Adding a Menu in PPDF</w:t>
       </w:r>
-      <w:bookmarkEnd w:id="14"/>
+      <w:bookmarkEnd w:id="13"/>
     </w:p>
     <w:p>
       <w:pPr>
         <w:pStyle w:val="Heading3"/>
       </w:pPr>
-      <w:bookmarkStart w:id="15" w:name="file-menu.cs"/>
-      <w:bookmarkStart w:id="16" w:name="_Toc203652345"/>
+      <w:bookmarkStart w:id="15" w:name="_Toc203652345"/>
+      <w:bookmarkStart w:id="16" w:name="file-menu.cs"/>
       <w:r>
         <w:t xml:space="preserve">File: </w:t>
       </w:r>
@@ -2017,7 +2017,7 @@
         </w:rPr>
         <w:t>Menu.cs</w:t>
       </w:r>
-      <w:bookmarkEnd w:id="16"/>
+      <w:bookmarkEnd w:id="15"/>
       <w:proofErr w:type="spellEnd"/>
     </w:p>
     <w:p>
@@ -2060,7 +2060,7 @@
         <w:t xml:space="preserve"> toolbar or menu for your connector.</w:t>
       </w:r>
     </w:p>
-    <w:bookmarkEnd w:id="15"/>
+    <w:bookmarkEnd w:id="16"/>
     <w:p>
       <w:pPr>
         <w:pStyle w:val="Heading3"/>
@@ -4047,7 +4047,7 @@
         <w:pStyle w:val="Heading1"/>
       </w:pPr>
       <w:bookmarkStart w:id="23" w:name="deploying-the-connector"/>
-      <w:bookmarkEnd w:id="13"/>
+      <w:bookmarkEnd w:id="14"/>
       <w:r>
         <w:lastRenderedPageBreak/>
         <w:t xml:space="preserve"> </w:t>
@@ -4131,8 +4131,8 @@
       <w:pPr>
         <w:pStyle w:val="Heading2"/>
       </w:pPr>
-      <w:bookmarkStart w:id="26" w:name="modifying-publishmode.xml"/>
-      <w:bookmarkStart w:id="27" w:name="_Toc203652354"/>
+      <w:bookmarkStart w:id="26" w:name="_Toc203652354"/>
+      <w:bookmarkStart w:id="27" w:name="modifying-publishmode.xml"/>
       <w:bookmarkEnd w:id="23"/>
       <w:r>
         <w:t xml:space="preserve">Modify </w:t>
@@ -4143,7 +4143,7 @@
         </w:rPr>
         <w:t>PublishMode.xml</w:t>
       </w:r>
-      <w:bookmarkEnd w:id="27"/>
+      <w:bookmarkEnd w:id="26"/>
     </w:p>
     <w:p>
       <w:pPr>
@@ -4154,11 +4154,15 @@
         </w:numPr>
       </w:pPr>
       <w:r>
-        <w:rPr>
-          <w:b/>
-          <w:bCs/>
-        </w:rPr>
-        <w:t>Power PDF reads this file when loading connectors.</w:t>
+        <w:t xml:space="preserve">This file </w:t>
+      </w:r>
+      <w:proofErr w:type="gramStart"/>
+      <w:r>
+        <w:t>to</w:t>
+      </w:r>
+      <w:proofErr w:type="gramEnd"/>
+      <w:r>
+        <w:t xml:space="preserve"> be updated in the following location:</w:t>
       </w:r>
     </w:p>
     <w:p>
@@ -4170,17 +4174,53 @@
         </w:numPr>
       </w:pPr>
       <w:r>
-        <w:t xml:space="preserve">It determines </w:t>
-      </w:r>
-      <w:r>
         <w:rPr>
           <w:b/>
           <w:bCs/>
-        </w:rPr>
-        <w:t>which UI actions are available</w:t>
-      </w:r>
-      <w:r>
-        <w:t xml:space="preserve"> to the user.</w:t>
+          <w:i/>
+          <w:iCs/>
+        </w:rPr>
+        <w:t>[Power PDF install folder]\resource\</w:t>
+      </w:r>
+      <w:proofErr w:type="spellStart"/>
+      <w:r>
+        <w:rPr>
+          <w:b/>
+          <w:bCs/>
+          <w:i/>
+          <w:iCs/>
+        </w:rPr>
+        <w:t>PowerPDF</w:t>
+      </w:r>
+      <w:proofErr w:type="spellEnd"/>
+      <w:r>
+        <w:rPr>
+          <w:b/>
+          <w:bCs/>
+          <w:i/>
+          <w:iCs/>
+        </w:rPr>
+        <w:t>\</w:t>
+      </w:r>
+      <w:proofErr w:type="spellStart"/>
+      <w:r>
+        <w:rPr>
+          <w:b/>
+          <w:bCs/>
+          <w:i/>
+          <w:iCs/>
+        </w:rPr>
+        <w:t>UILayout</w:t>
+      </w:r>
+      <w:proofErr w:type="spellEnd"/>
+      <w:r>
+        <w:rPr>
+          <w:b/>
+          <w:bCs/>
+          <w:i/>
+          <w:iCs/>
+        </w:rPr>
+        <w:t>\Publish Mode.xml</w:t>
       </w:r>
     </w:p>
     <w:p>
@@ -4192,6 +4232,40 @@
         </w:numPr>
       </w:pPr>
       <w:r>
+        <w:t>Power PDF reads this file when loading connectors.</w:t>
+      </w:r>
+    </w:p>
+    <w:p>
+      <w:pPr>
+        <w:pStyle w:val="FirstParagraph"/>
+        <w:numPr>
+          <w:ilvl w:val="0"/>
+          <w:numId w:val="25"/>
+        </w:numPr>
+      </w:pPr>
+      <w:r>
+        <w:t xml:space="preserve">It determines </w:t>
+      </w:r>
+      <w:r>
+        <w:rPr>
+          <w:b/>
+          <w:bCs/>
+        </w:rPr>
+        <w:t>which UI actions are available</w:t>
+      </w:r>
+      <w:r>
+        <w:t xml:space="preserve"> to the user.</w:t>
+      </w:r>
+    </w:p>
+    <w:p>
+      <w:pPr>
+        <w:pStyle w:val="FirstParagraph"/>
+        <w:numPr>
+          <w:ilvl w:val="0"/>
+          <w:numId w:val="25"/>
+        </w:numPr>
+      </w:pPr>
+      <w:r>
         <w:t xml:space="preserve">All the entries added in </w:t>
       </w:r>
       <w:proofErr w:type="spellStart"/>
@@ -4222,11 +4296,25 @@
       </w:r>
     </w:p>
     <w:p>
-      <w:r>
+      <w:pPr>
+        <w:rPr>
+          <w:b/>
+          <w:bCs/>
+        </w:rPr>
+      </w:pPr>
+      <w:r>
+        <w:rPr>
+          <w:b/>
+          <w:bCs/>
+        </w:rPr>
         <w:t xml:space="preserve"> </w:t>
       </w:r>
       <w:proofErr w:type="spellStart"/>
       <w:r>
+        <w:rPr>
+          <w:b/>
+          <w:bCs/>
+        </w:rPr>
         <w:t>Menu.cs</w:t>
       </w:r>
       <w:proofErr w:type="spellEnd"/>
@@ -4662,13 +4750,21 @@
         <w:pStyle w:val="Heading2"/>
       </w:pPr>
       <w:bookmarkStart w:id="28" w:name="build-settings"/>
-      <w:bookmarkEnd w:id="26"/>
+      <w:bookmarkEnd w:id="27"/>
     </w:p>
     <w:p>
       <w:pPr>
         <w:pStyle w:val="BodyText"/>
-      </w:pPr>
-      <w:r>
+        <w:rPr>
+          <w:b/>
+          <w:bCs/>
+        </w:rPr>
+      </w:pPr>
+      <w:r>
+        <w:rPr>
+          <w:b/>
+          <w:bCs/>
+        </w:rPr>
         <w:t>Corresponding change in Publish Mode.xml</w:t>
       </w:r>
     </w:p>
@@ -4919,7 +5015,6 @@
       </w:pPr>
       <w:bookmarkStart w:id="30" w:name="_Toc203652355"/>
       <w:r>
-        <w:lastRenderedPageBreak/>
         <w:t>Add Group Name</w:t>
       </w:r>
       <w:bookmarkEnd w:id="30"/>
@@ -5227,6 +5322,7 @@
       </w:pPr>
       <w:bookmarkStart w:id="32" w:name="_Toc203652357"/>
       <w:r>
+        <w:lastRenderedPageBreak/>
         <w:t>Clear Cache</w:t>
       </w:r>
       <w:bookmarkEnd w:id="32"/>
@@ -5308,7 +5404,7 @@
 <w:numbering xmlns:wpc="http://schemas.microsoft.com/office/word/2010/wordprocessingCanvas" xmlns:cx="http://schemas.microsoft.com/office/drawing/2014/chartex" xmlns:cx1="http://schemas.microsoft.com/office/drawing/2015/9/8/chartex" xmlns:cx2="http://schemas.microsoft.com/office/drawing/2015/10/21/chartex" xmlns:cx3="http://schemas.microsoft.com/office/drawing/2016/5/9/chartex" xmlns:cx4="http://schemas.microsoft.com/office/drawing/2016/5/10/chartex" xmlns:cx5="http://schemas.microsoft.com/office/drawing/2016/5/11/chartex" xmlns:cx6="http://schemas.microsoft.com/office/drawing/2016/5/12/chartex" xmlns:cx7="http://schemas.microsoft.com/office/drawing/2016/5/13/chartex" xmlns:cx8="http://schemas.microsoft.com/office/drawing/2016/5/14/chartex" xmlns:mc="http://schemas.openxmlformats.org/markup-compatibility/2006" xmlns:aink="http://schemas.microsoft.com/office/drawing/2016/ink" xmlns:am3d="http://schemas.microsoft.com/office/drawing/2017/model3d" xmlns:o="urn:schemas-microsoft-com:office:office" xmlns:oel="http://schemas.microsoft.com/office/2019/extlst" xmlns:r="http://schemas.openxmlformats.org/officeDocument/2006/relationships" xmlns:m="http://schemas.openxmlformats.org/officeDocument/2006/math" xmlns:v="urn:schemas-microsoft-com:vml" xmlns:wp14="http://schemas.microsoft.com/office/word/2010/wordprocessingDrawing" xmlns:wp="http://schemas.openxmlformats.org/drawingml/2006/wordprocessingDrawing" xmlns:w10="urn:schemas-microsoft-com:office:word" xmlns:w="http://schemas.openxmlformats.org/wordprocessingml/2006/main" xmlns:w14="http://schemas.microsoft.com/office/word/2010/wordml" xmlns:w15="http://schemas.microsoft.com/office/word/2012/wordml" xmlns:w16cex="http://schemas.microsoft.com/office/word/2018/wordml/cex" xmlns:w16cid="http://schemas.microsoft.com/office/word/2016/wordml/cid" xmlns:w16="http://schemas.microsoft.com/office/word/2018/wordml" xmlns:w16du="http://schemas.microsoft.com/office/word/2023/wordml/word16du" xmlns:w16sdtdh="http://schemas.microsoft.com/office/word/2020/wordml/sdtdatahash" xmlns:w16sdtfl="http://schemas.microsoft.com/office/word/2024/wordml/sdtformatlock" xmlns:w16se="http://schemas.microsoft.com/office/word/2015/wordml/symex" xmlns:wpg="http://schemas.microsoft.com/office/word/2010/wordprocessingGroup" xmlns:wpi="http://schemas.microsoft.com/office/word/2010/wordprocessingInk" xmlns:wne="http://schemas.microsoft.com/office/word/2006/wordml" xmlns:wps="http://schemas.microsoft.com/office/word/2010/wordprocessingShape" mc:Ignorable="w14 w15 w16se w16cid w16 w16cex w16sdtdh w16sdtfl w16du wp14">
   <w:numPicBullet w:numPicBulletId="0">
     <w:pict>
-      <v:rect id="_x0000_i1036" style="width:0;height:1.5pt" o:hralign="center" o:bullet="t" o:hrstd="t" o:hr="t"/>
+      <v:rect id="_x0000_i1032" style="width:0;height:1.5pt" o:hralign="center" o:bullet="t" o:hrstd="t" o:hr="t"/>
     </w:pict>
   </w:numPicBullet>
   <w:abstractNum w:abstractNumId="0" w15:restartNumberingAfterBreak="0">
@@ -7606,7 +7702,6 @@
   <w:style w:type="character" w:default="1" w:styleId="DefaultParagraphFont">
     <w:name w:val="Default Paragraph Font"/>
     <w:uiPriority w:val="1"/>
-    <w:semiHidden/>
     <w:unhideWhenUsed/>
   </w:style>
   <w:style w:type="table" w:default="1" w:styleId="TableNormal">

</xml_diff>